<commit_message>
Terminamos la tarea 3 de entornos de desarrollo y exportamos a pdf, subimos a repositorio
</commit_message>
<xml_diff>
--- a/Apuntes-1DAM/Entornos de Desarrollo/1DAMV_E03_ArocaRodriguez_MiguelAngel.docx
+++ b/Apuntes-1DAM/Entornos de Desarrollo/1DAMV_E03_ArocaRodriguez_MiguelAngel.docx
@@ -7,13 +7,19 @@
         <w:pStyle w:val="Title"/>
         <w:numPr>
           <w:ilvl w:val="0"/>
-          <w:numId w:val="2"/>
+          <w:numId w:val="0"/>
         </w:numPr>
-        <w:rPr/>
-      </w:pPr>
-      <w:r>
-        <w:rPr/>
-        <w:t>Tipos de metodologías ágiles.</w:t>
+        <w:ind w:hanging="0" w:start="720"/>
+        <w:jc w:val="center"/>
+        <w:rPr/>
+      </w:pPr>
+      <w:r>
+        <w:rPr/>
+        <w:t>M</w:t>
+      </w:r>
+      <w:r>
+        <w:rPr/>
+        <w:t>etodologías ágiles.</w:t>
       </w:r>
     </w:p>
     <w:p>
@@ -38,7 +44,12 @@
       </w:pPr>
       <w:r>
         <w:rPr/>
+        <w:tab/>
         <w:t xml:space="preserve">Las metodologías ágiles son formas de trabajo que dividen el trabajo de desarrollo en ciclos cortos y se adaptan según las necesidades que van surgiendo a lo largo del proyecto para entregar valor continuamente. </w:t>
+      </w:r>
+      <w:r>
+        <w:rPr/>
+        <w:t>Se trata de enfoques dinámicos, sujetos al cambio y en constante evolución. Son, a su vez, participativos al estar involucrados en el proyecto tanto el equipo de desarrollo como el cliente final. Esto supone también que la comunicación durante el proyecto es un aspecto clave.</w:t>
       </w:r>
     </w:p>
     <w:p>
@@ -53,63 +64,76 @@
       </w:pPr>
       <w:r>
         <w:rPr/>
-        <w:t xml:space="preserve"> </w:t>
-      </w:r>
-      <w:r>
-        <w:rPr/>
+        <w:tab/>
         <w:t>Existen diferentes tipos, aunque los principales son Scrum, Kanban, SCRUMban, Lean y Extreme Programming.</w:t>
       </w:r>
     </w:p>
     <w:p>
       <w:pPr>
         <w:pStyle w:val="Normal"/>
-        <w:jc w:val="both"/>
-        <w:rPr/>
-      </w:pPr>
-      <w:r>
-        <w:rPr/>
-        <w:t xml:space="preserve">1. Scrum: Divide proyectos complejos o de muy larga duración en ciclos cortos, generalmente de 1 a 4 semanas, para entregar valor periódicamente y coordinarse con el cliente con los posibles cambios que puedan surgir. </w:t>
+        <w:numPr>
+          <w:ilvl w:val="0"/>
+          <w:numId w:val="2"/>
+        </w:numPr>
+        <w:jc w:val="both"/>
+        <w:rPr/>
+      </w:pPr>
+      <w:r>
+        <w:rPr/>
+        <w:t xml:space="preserve">Scrum: Divide proyectos complejos o de muy larga duración en ciclos cortos, generalmente de 1 a 4 semanas, para entregar valor periódicamente y coordinarse con el cliente con los posibles cambios que puedan surgir. </w:t>
       </w:r>
     </w:p>
     <w:p>
       <w:pPr>
         <w:pStyle w:val="Normal"/>
-        <w:jc w:val="both"/>
-        <w:rPr/>
-      </w:pPr>
-      <w:r>
-        <w:rPr/>
-        <w:t>2. Kanban es un método de trabajo caracterizado por representar las tareas en una tabla que describa el estado en el que se encuentra cada una (pendiente, en curso, en revisión, finalizada). Cada columna de la tabla tiene un límite máximo de tareas  y debe estar bien especificado en que momento una tarea pasa de una columna a otra. El propósito de esta metodología es evitar la multitarea y  optimizar los flujos de trabajo.</w:t>
+        <w:numPr>
+          <w:ilvl w:val="0"/>
+          <w:numId w:val="2"/>
+        </w:numPr>
+        <w:jc w:val="both"/>
+        <w:rPr/>
+      </w:pPr>
+      <w:r>
+        <w:rPr/>
+        <w:t>Kanban es un método de trabajo caracterizado por representar las tareas en una tabla que describa el estado en el que se encuentra cada una (pendiente, en curso, en revisión, finalizada). Cada columna de la tabla tiene un límite máximo de tareas  y debe estar bien especificado en que momento una tarea pasa de una columna a otra. El propósito de esta metodología es evitar la multitarea y  optimizar los flujos de trabajo.</w:t>
       </w:r>
     </w:p>
     <w:p>
       <w:pPr>
         <w:pStyle w:val="Normal"/>
-        <w:jc w:val="both"/>
-        <w:rPr/>
-      </w:pPr>
-      <w:r>
-        <w:rPr/>
-        <w:t>3. SCRUMban: Es un híbrido de Scrum y Kanban sin la presencia de roles fijos. Mezcla los ciclos cortos de desarrollo con la tabla de tareas de Kanban.</w:t>
+        <w:numPr>
+          <w:ilvl w:val="0"/>
+          <w:numId w:val="2"/>
+        </w:numPr>
+        <w:jc w:val="both"/>
+        <w:rPr/>
+      </w:pPr>
+      <w:r>
+        <w:rPr/>
+        <w:t>SCRUMban: Es un híbrido de Scrum y Kanban sin la presencia de roles fijos. Mezcla los ciclos cortos de desarrollo con la tabla de tareas de Kanban.</w:t>
       </w:r>
     </w:p>
     <w:p>
       <w:pPr>
         <w:pStyle w:val="Normal"/>
-        <w:jc w:val="both"/>
-        <w:rPr/>
-      </w:pPr>
-      <w:r>
-        <w:rPr/>
-        <w:t xml:space="preserve">4. Lean:  Es una metodología basada en 7 principios: </w:t>
+        <w:numPr>
+          <w:ilvl w:val="0"/>
+          <w:numId w:val="2"/>
+        </w:numPr>
+        <w:jc w:val="both"/>
+        <w:rPr/>
+      </w:pPr>
+      <w:r>
+        <w:rPr/>
+        <w:t xml:space="preserve">Lean:  Es una metodología basada en 7 principios: </w:t>
       </w:r>
     </w:p>
     <w:p>
       <w:pPr>
         <w:pStyle w:val="ListParagraph"/>
         <w:numPr>
-          <w:ilvl w:val="0"/>
-          <w:numId w:val="1"/>
+          <w:ilvl w:val="1"/>
+          <w:numId w:val="2"/>
         </w:numPr>
         <w:jc w:val="both"/>
         <w:rPr/>
@@ -123,8 +147,8 @@
       <w:pPr>
         <w:pStyle w:val="ListParagraph"/>
         <w:numPr>
-          <w:ilvl w:val="0"/>
-          <w:numId w:val="1"/>
+          <w:ilvl w:val="1"/>
+          <w:numId w:val="2"/>
         </w:numPr>
         <w:jc w:val="both"/>
         <w:rPr/>
@@ -138,8 +162,8 @@
       <w:pPr>
         <w:pStyle w:val="ListParagraph"/>
         <w:numPr>
-          <w:ilvl w:val="0"/>
-          <w:numId w:val="1"/>
+          <w:ilvl w:val="1"/>
+          <w:numId w:val="2"/>
         </w:numPr>
         <w:jc w:val="both"/>
         <w:rPr/>
@@ -153,8 +177,8 @@
       <w:pPr>
         <w:pStyle w:val="ListParagraph"/>
         <w:numPr>
-          <w:ilvl w:val="0"/>
-          <w:numId w:val="1"/>
+          <w:ilvl w:val="1"/>
+          <w:numId w:val="2"/>
         </w:numPr>
         <w:jc w:val="both"/>
         <w:rPr/>
@@ -168,8 +192,8 @@
       <w:pPr>
         <w:pStyle w:val="ListParagraph"/>
         <w:numPr>
-          <w:ilvl w:val="0"/>
-          <w:numId w:val="1"/>
+          <w:ilvl w:val="1"/>
+          <w:numId w:val="2"/>
         </w:numPr>
         <w:jc w:val="both"/>
         <w:rPr/>
@@ -183,8 +207,8 @@
       <w:pPr>
         <w:pStyle w:val="ListParagraph"/>
         <w:numPr>
-          <w:ilvl w:val="0"/>
-          <w:numId w:val="1"/>
+          <w:ilvl w:val="1"/>
+          <w:numId w:val="2"/>
         </w:numPr>
         <w:jc w:val="both"/>
         <w:rPr/>
@@ -198,15 +222,31 @@
       <w:pPr>
         <w:pStyle w:val="ListParagraph"/>
         <w:numPr>
+          <w:ilvl w:val="1"/>
+          <w:numId w:val="2"/>
+        </w:numPr>
+        <w:jc w:val="both"/>
+        <w:rPr/>
+      </w:pPr>
+      <w:r>
+        <w:rPr/>
+        <w:t>Optimizar el sistema desde su conjunto, no partes aisladas.</w:t>
+      </w:r>
+    </w:p>
+    <w:p>
+      <w:pPr>
+        <w:pStyle w:val="Normal"/>
+        <w:numPr>
           <w:ilvl w:val="0"/>
-          <w:numId w:val="1"/>
+          <w:numId w:val="2"/>
         </w:numPr>
-        <w:jc w:val="both"/>
-        <w:rPr/>
-      </w:pPr>
-      <w:r>
-        <w:rPr/>
-        <w:t>Optimizar el sistema desde su conjunto, no partes aisladas.</w:t>
+        <w:spacing w:before="0" w:after="160"/>
+        <w:jc w:val="both"/>
+        <w:rPr/>
+      </w:pPr>
+      <w:r>
+        <w:rPr/>
+        <w:t>Extreme Programming: Metodología que trabaja con ciclos muy cortos, de 1 a 2 semanas, con entregas frecuentes de valor. Se caracteriza por trabajar en pares, una persona escribe el código y otra lo revisa. Se crean primero los test para comprobar el código y luego el código que debe pasar el test. Se prueba el código diariamente y se trata de hacer el código lo más simple posible.</w:t>
       </w:r>
     </w:p>
     <w:p>
@@ -219,7 +259,78 @@
       </w:pPr>
       <w:r>
         <w:rPr/>
-        <w:t>5. Extreme Programming: Metodología que trabaja con ciclos muy cortos, de 1 a 2 semanas, con entregas frecuentes de valor. Se caracteriza por trabajar en pares, una persona escribe el código y otra lo revisa. Se crean primero los test para comprobar el código y luego el código que debe pasar el test. Se prueba el código diariamente y se trata de hacer el código lo más simple posible.</w:t>
+        <w:tab/>
+        <w:t xml:space="preserve">A modo de establecer una comparativa, </w:t>
+      </w:r>
+      <w:r>
+        <w:rPr/>
+        <w:t xml:space="preserve">en primer lugar </w:t>
+      </w:r>
+      <w:r>
+        <w:rPr/>
+        <w:t xml:space="preserve">podríamos definir el enfoque tradicional como un enfoque predictivo, en el cual debe conocerse y predecirse todos los requerimientos y objetivos del proyecto desde el inicio para así evitar tener que introducir cambios durante el desarrollo del mismo. Una analogía para ilustrar el concepto de este tipo de enfoque sería el construir un edificio. Primero han de diseñarse todos los planos y establecerse materiales y técnicas a utilizar y luego empezar a construirlo. Asimismo, se debe evitar cambiar el diseño del edificio durante su construcción dado que resultaría extremadamente caro cambiar el diseño </w:t>
+      </w:r>
+      <w:r>
+        <w:rPr/>
+        <w:t>y podría dar lugar a muchos más errores o defectos arquitectónicos que implicarían realizar muchos más cambios</w:t>
+      </w:r>
+      <w:r>
+        <w:rPr/>
+        <w:t>.</w:t>
+      </w:r>
+    </w:p>
+    <w:p>
+      <w:pPr>
+        <w:pStyle w:val="Normal"/>
+        <w:spacing w:before="0" w:after="160"/>
+        <w:ind w:hanging="0" w:start="0"/>
+        <w:jc w:val="both"/>
+        <w:rPr/>
+      </w:pPr>
+      <w:r>
+        <w:rPr/>
+      </w:r>
+    </w:p>
+    <w:p>
+      <w:pPr>
+        <w:pStyle w:val="Normal"/>
+        <w:spacing w:before="0" w:after="160"/>
+        <w:ind w:hanging="0" w:start="0"/>
+        <w:jc w:val="both"/>
+        <w:rPr/>
+      </w:pPr>
+      <w:r>
+        <w:rPr/>
+        <w:t>Establecidos los conceptos, podríamos decir que las metodologías ágiles ganan ventaja con respecto a las metodologías tradicionales en aspectos como la adaptabilidad del proyecto, funcionalidad y riesgo, dado que al realizarse ciclos de desarrollo cortos y probados y la comunicación entre equipo y cliente, el resultado final tiene muchas más probabilidades de ser funcional y satisfactorio.</w:t>
+      </w:r>
+    </w:p>
+    <w:p>
+      <w:pPr>
+        <w:pStyle w:val="Normal"/>
+        <w:spacing w:before="0" w:after="160"/>
+        <w:ind w:hanging="0" w:start="0"/>
+        <w:jc w:val="both"/>
+        <w:rPr/>
+      </w:pPr>
+      <w:r>
+        <w:rPr/>
+      </w:r>
+    </w:p>
+    <w:p>
+      <w:pPr>
+        <w:pStyle w:val="Normal"/>
+        <w:spacing w:before="0" w:after="160"/>
+        <w:ind w:hanging="0" w:start="0"/>
+        <w:jc w:val="both"/>
+        <w:rPr/>
+      </w:pPr>
+      <w:r>
+        <w:rPr/>
+        <w:tab/>
+      </w:r>
+      <w:r>
+        <w:rPr/>
+        <w:t>A modo de conclusión, si hubiera que escoger una metodología para realizar un proyecto, en mi opinión, escogería la metodología SCRUMban. Esto es porque considero que la mezcla de ciclos cortos y la comunicación con el cliente del método SCRUM junto con la organización de tareas y la optimización de los flujos de trabajo de Kanban es la mejor manera de llevar a cabo un ciclo de desarrollo de forma organizada, ágil y efectiva.</w:t>
       </w:r>
     </w:p>
     <w:sectPr>
@@ -247,111 +358,111 @@
         <w:tabs>
           <w:tab w:val="num" w:pos="0"/>
         </w:tabs>
-        <w:ind w:start="1428" w:hanging="360"/>
+        <w:ind w:start="720" w:hanging="360"/>
       </w:pPr>
       <w:rPr/>
     </w:lvl>
     <w:lvl w:ilvl="1">
       <w:start w:val="1"/>
+      <w:numFmt w:val="lowerLetter"/>
+      <w:lvlText w:val="%2."/>
+      <w:lvlJc w:val="start"/>
+      <w:pPr>
+        <w:tabs>
+          <w:tab w:val="num" w:pos="0"/>
+        </w:tabs>
+        <w:ind w:start="1440" w:hanging="360"/>
+      </w:pPr>
+      <w:rPr/>
+    </w:lvl>
+    <w:lvl w:ilvl="2">
+      <w:start w:val="1"/>
+      <w:numFmt w:val="lowerRoman"/>
+      <w:lvlText w:val="%3."/>
+      <w:lvlJc w:val="end"/>
+      <w:pPr>
+        <w:tabs>
+          <w:tab w:val="num" w:pos="0"/>
+        </w:tabs>
+        <w:ind w:start="2160" w:hanging="180"/>
+      </w:pPr>
+      <w:rPr/>
+    </w:lvl>
+    <w:lvl w:ilvl="3">
+      <w:start w:val="1"/>
       <w:numFmt w:val="decimal"/>
-      <w:lvlText w:val="%1.%2."/>
-      <w:lvlJc w:val="start"/>
-      <w:pPr>
-        <w:tabs>
-          <w:tab w:val="num" w:pos="0"/>
-        </w:tabs>
-        <w:ind w:start="2148" w:hanging="360"/>
-      </w:pPr>
-      <w:rPr/>
-    </w:lvl>
-    <w:lvl w:ilvl="2">
+      <w:lvlText w:val="%4."/>
+      <w:lvlJc w:val="start"/>
+      <w:pPr>
+        <w:tabs>
+          <w:tab w:val="num" w:pos="0"/>
+        </w:tabs>
+        <w:ind w:start="2880" w:hanging="360"/>
+      </w:pPr>
+      <w:rPr/>
+    </w:lvl>
+    <w:lvl w:ilvl="4">
+      <w:start w:val="1"/>
+      <w:numFmt w:val="lowerLetter"/>
+      <w:lvlText w:val="%5."/>
+      <w:lvlJc w:val="start"/>
+      <w:pPr>
+        <w:tabs>
+          <w:tab w:val="num" w:pos="0"/>
+        </w:tabs>
+        <w:ind w:start="3600" w:hanging="360"/>
+      </w:pPr>
+      <w:rPr/>
+    </w:lvl>
+    <w:lvl w:ilvl="5">
+      <w:start w:val="1"/>
+      <w:numFmt w:val="lowerRoman"/>
+      <w:lvlText w:val="%6."/>
+      <w:lvlJc w:val="end"/>
+      <w:pPr>
+        <w:tabs>
+          <w:tab w:val="num" w:pos="0"/>
+        </w:tabs>
+        <w:ind w:start="4320" w:hanging="180"/>
+      </w:pPr>
+      <w:rPr/>
+    </w:lvl>
+    <w:lvl w:ilvl="6">
       <w:start w:val="1"/>
       <w:numFmt w:val="decimal"/>
-      <w:lvlText w:val="%1.%2.%3."/>
-      <w:lvlJc w:val="start"/>
-      <w:pPr>
-        <w:tabs>
-          <w:tab w:val="num" w:pos="0"/>
-        </w:tabs>
-        <w:ind w:start="2868" w:hanging="360"/>
-      </w:pPr>
-      <w:rPr/>
-    </w:lvl>
-    <w:lvl w:ilvl="3">
-      <w:start w:val="1"/>
-      <w:numFmt w:val="decimal"/>
-      <w:lvlText w:val="%1.%2.%3.%4."/>
-      <w:lvlJc w:val="start"/>
-      <w:pPr>
-        <w:tabs>
-          <w:tab w:val="num" w:pos="0"/>
-        </w:tabs>
-        <w:ind w:start="3588" w:hanging="360"/>
-      </w:pPr>
-      <w:rPr/>
-    </w:lvl>
-    <w:lvl w:ilvl="4">
-      <w:start w:val="1"/>
-      <w:numFmt w:val="decimal"/>
-      <w:lvlText w:val="%1.%2.%3.%4.%5."/>
-      <w:lvlJc w:val="start"/>
-      <w:pPr>
-        <w:tabs>
-          <w:tab w:val="num" w:pos="0"/>
-        </w:tabs>
-        <w:ind w:start="4308" w:hanging="360"/>
-      </w:pPr>
-      <w:rPr/>
-    </w:lvl>
-    <w:lvl w:ilvl="5">
-      <w:start w:val="1"/>
-      <w:numFmt w:val="decimal"/>
-      <w:lvlText w:val="%1.%2.%3.%4.%5.%6."/>
-      <w:lvlJc w:val="start"/>
-      <w:pPr>
-        <w:tabs>
-          <w:tab w:val="num" w:pos="0"/>
-        </w:tabs>
-        <w:ind w:start="5028" w:hanging="360"/>
-      </w:pPr>
-      <w:rPr/>
-    </w:lvl>
-    <w:lvl w:ilvl="6">
-      <w:start w:val="1"/>
-      <w:numFmt w:val="decimal"/>
-      <w:lvlText w:val="%1.%2.%3.%4.%5.%6.%7."/>
-      <w:lvlJc w:val="start"/>
-      <w:pPr>
-        <w:tabs>
-          <w:tab w:val="num" w:pos="0"/>
-        </w:tabs>
-        <w:ind w:start="5748" w:hanging="360"/>
+      <w:lvlText w:val="%7."/>
+      <w:lvlJc w:val="start"/>
+      <w:pPr>
+        <w:tabs>
+          <w:tab w:val="num" w:pos="0"/>
+        </w:tabs>
+        <w:ind w:start="5040" w:hanging="360"/>
       </w:pPr>
       <w:rPr/>
     </w:lvl>
     <w:lvl w:ilvl="7">
       <w:start w:val="1"/>
-      <w:numFmt w:val="decimal"/>
-      <w:lvlText w:val="%1.%2.%3.%4.%5.%6.%7.%8."/>
-      <w:lvlJc w:val="start"/>
-      <w:pPr>
-        <w:tabs>
-          <w:tab w:val="num" w:pos="0"/>
-        </w:tabs>
-        <w:ind w:start="6468" w:hanging="360"/>
+      <w:numFmt w:val="lowerLetter"/>
+      <w:lvlText w:val="%8."/>
+      <w:lvlJc w:val="start"/>
+      <w:pPr>
+        <w:tabs>
+          <w:tab w:val="num" w:pos="0"/>
+        </w:tabs>
+        <w:ind w:start="5760" w:hanging="360"/>
       </w:pPr>
       <w:rPr/>
     </w:lvl>
     <w:lvl w:ilvl="8">
       <w:start w:val="1"/>
-      <w:numFmt w:val="decimal"/>
-      <w:lvlText w:val="%1.%2.%3.%4.%5.%6.%7.%8.%9."/>
-      <w:lvlJc w:val="start"/>
-      <w:pPr>
-        <w:tabs>
-          <w:tab w:val="num" w:pos="0"/>
-        </w:tabs>
-        <w:ind w:start="7188" w:hanging="360"/>
+      <w:numFmt w:val="lowerRoman"/>
+      <w:lvlText w:val="%9."/>
+      <w:lvlJc w:val="end"/>
+      <w:pPr>
+        <w:tabs>
+          <w:tab w:val="num" w:pos="0"/>
+        </w:tabs>
+        <w:ind w:start="6480" w:hanging="180"/>
       </w:pPr>
       <w:rPr/>
     </w:lvl>
@@ -364,7 +475,7 @@
       <w:lvlJc w:val="start"/>
       <w:pPr>
         <w:tabs>
-          <w:tab w:val="num" w:pos="0"/>
+          <w:tab w:val="num" w:pos="720"/>
         </w:tabs>
         <w:ind w:start="720" w:hanging="360"/>
       </w:pPr>
@@ -372,27 +483,27 @@
     </w:lvl>
     <w:lvl w:ilvl="1">
       <w:start w:val="1"/>
-      <w:numFmt w:val="lowerLetter"/>
+      <w:numFmt w:val="decimal"/>
       <w:lvlText w:val="%2."/>
       <w:lvlJc w:val="start"/>
       <w:pPr>
         <w:tabs>
-          <w:tab w:val="num" w:pos="0"/>
+          <w:tab w:val="num" w:pos="1080"/>
+        </w:tabs>
+        <w:ind w:start="1080" w:hanging="360"/>
+      </w:pPr>
+      <w:rPr/>
+    </w:lvl>
+    <w:lvl w:ilvl="2">
+      <w:start w:val="1"/>
+      <w:numFmt w:val="decimal"/>
+      <w:lvlText w:val="%3."/>
+      <w:lvlJc w:val="start"/>
+      <w:pPr>
+        <w:tabs>
+          <w:tab w:val="num" w:pos="1440"/>
         </w:tabs>
         <w:ind w:start="1440" w:hanging="360"/>
-      </w:pPr>
-      <w:rPr/>
-    </w:lvl>
-    <w:lvl w:ilvl="2">
-      <w:start w:val="1"/>
-      <w:numFmt w:val="lowerRoman"/>
-      <w:lvlText w:val="%3."/>
-      <w:lvlJc w:val="end"/>
-      <w:pPr>
-        <w:tabs>
-          <w:tab w:val="num" w:pos="0"/>
-        </w:tabs>
-        <w:ind w:start="2160" w:hanging="180"/>
       </w:pPr>
       <w:rPr/>
     </w:lvl>
@@ -403,74 +514,74 @@
       <w:lvlJc w:val="start"/>
       <w:pPr>
         <w:tabs>
-          <w:tab w:val="num" w:pos="0"/>
+          <w:tab w:val="num" w:pos="1800"/>
+        </w:tabs>
+        <w:ind w:start="1800" w:hanging="360"/>
+      </w:pPr>
+      <w:rPr/>
+    </w:lvl>
+    <w:lvl w:ilvl="4">
+      <w:start w:val="1"/>
+      <w:numFmt w:val="decimal"/>
+      <w:lvlText w:val="%5."/>
+      <w:lvlJc w:val="start"/>
+      <w:pPr>
+        <w:tabs>
+          <w:tab w:val="num" w:pos="2160"/>
+        </w:tabs>
+        <w:ind w:start="2160" w:hanging="360"/>
+      </w:pPr>
+      <w:rPr/>
+    </w:lvl>
+    <w:lvl w:ilvl="5">
+      <w:start w:val="1"/>
+      <w:numFmt w:val="decimal"/>
+      <w:lvlText w:val="%6"/>
+      <w:lvlJc w:val="start"/>
+      <w:pPr>
+        <w:tabs>
+          <w:tab w:val="num" w:pos="2520"/>
+        </w:tabs>
+        <w:ind w:start="2520" w:hanging="360"/>
+      </w:pPr>
+      <w:rPr/>
+    </w:lvl>
+    <w:lvl w:ilvl="6">
+      <w:start w:val="1"/>
+      <w:numFmt w:val="decimal"/>
+      <w:lvlText w:val="%7"/>
+      <w:lvlJc w:val="start"/>
+      <w:pPr>
+        <w:tabs>
+          <w:tab w:val="num" w:pos="2880"/>
         </w:tabs>
         <w:ind w:start="2880" w:hanging="360"/>
       </w:pPr>
       <w:rPr/>
     </w:lvl>
-    <w:lvl w:ilvl="4">
-      <w:start w:val="1"/>
-      <w:numFmt w:val="lowerLetter"/>
-      <w:lvlText w:val="%5."/>
-      <w:lvlJc w:val="start"/>
-      <w:pPr>
-        <w:tabs>
-          <w:tab w:val="num" w:pos="0"/>
+    <w:lvl w:ilvl="7">
+      <w:start w:val="1"/>
+      <w:numFmt w:val="decimal"/>
+      <w:lvlText w:val="%8"/>
+      <w:lvlJc w:val="start"/>
+      <w:pPr>
+        <w:tabs>
+          <w:tab w:val="num" w:pos="3240"/>
+        </w:tabs>
+        <w:ind w:start="3240" w:hanging="360"/>
+      </w:pPr>
+      <w:rPr/>
+    </w:lvl>
+    <w:lvl w:ilvl="8">
+      <w:start w:val="1"/>
+      <w:numFmt w:val="decimal"/>
+      <w:lvlText w:val="%9"/>
+      <w:lvlJc w:val="start"/>
+      <w:pPr>
+        <w:tabs>
+          <w:tab w:val="num" w:pos="3600"/>
         </w:tabs>
         <w:ind w:start="3600" w:hanging="360"/>
-      </w:pPr>
-      <w:rPr/>
-    </w:lvl>
-    <w:lvl w:ilvl="5">
-      <w:start w:val="1"/>
-      <w:numFmt w:val="lowerRoman"/>
-      <w:lvlText w:val="%6."/>
-      <w:lvlJc w:val="end"/>
-      <w:pPr>
-        <w:tabs>
-          <w:tab w:val="num" w:pos="0"/>
-        </w:tabs>
-        <w:ind w:start="4320" w:hanging="180"/>
-      </w:pPr>
-      <w:rPr/>
-    </w:lvl>
-    <w:lvl w:ilvl="6">
-      <w:start w:val="1"/>
-      <w:numFmt w:val="decimal"/>
-      <w:lvlText w:val="%7."/>
-      <w:lvlJc w:val="start"/>
-      <w:pPr>
-        <w:tabs>
-          <w:tab w:val="num" w:pos="0"/>
-        </w:tabs>
-        <w:ind w:start="5040" w:hanging="360"/>
-      </w:pPr>
-      <w:rPr/>
-    </w:lvl>
-    <w:lvl w:ilvl="7">
-      <w:start w:val="1"/>
-      <w:numFmt w:val="lowerLetter"/>
-      <w:lvlText w:val="%8."/>
-      <w:lvlJc w:val="start"/>
-      <w:pPr>
-        <w:tabs>
-          <w:tab w:val="num" w:pos="0"/>
-        </w:tabs>
-        <w:ind w:start="5760" w:hanging="360"/>
-      </w:pPr>
-      <w:rPr/>
-    </w:lvl>
-    <w:lvl w:ilvl="8">
-      <w:start w:val="1"/>
-      <w:numFmt w:val="lowerRoman"/>
-      <w:lvlText w:val="%9."/>
-      <w:lvlJc w:val="end"/>
-      <w:pPr>
-        <w:tabs>
-          <w:tab w:val="num" w:pos="0"/>
-        </w:tabs>
-        <w:ind w:start="6480" w:hanging="180"/>
       </w:pPr>
       <w:rPr/>
     </w:lvl>
@@ -1001,6 +1112,7 @@
     <w:qFormat/>
     <w:pPr>
       <w:widowControl/>
+      <w:suppressAutoHyphens w:val="true"/>
       <w:bidi w:val="0"/>
       <w:spacing w:lineRule="auto" w:line="278" w:before="0" w:after="160"/>
       <w:jc w:val="start"/>
@@ -1019,6 +1131,16 @@
     <w:uiPriority w:val="1"/>
     <w:semiHidden/>
     <w:unhideWhenUsed/>
+    <w:rPr/>
+  </w:style>
+  <w:style w:type="character" w:styleId="Bolos">
+    <w:name w:val="Bolos"/>
+    <w:rPr>
+      <w:rFonts w:ascii="OpenSymbol" w:hAnsi="OpenSymbol" w:eastAsia="OpenSymbol" w:cs="OpenSymbol"/>
+    </w:rPr>
+  </w:style>
+  <w:style w:type="character" w:styleId="Smbolosdenumeracin">
+    <w:name w:val="Símbolos de numeración"/>
     <w:rPr/>
   </w:style>
   <w:style w:type="paragraph" w:styleId="Ttulo">
@@ -1076,6 +1198,30 @@
       <w:rFonts w:cs="Arial"/>
     </w:rPr>
   </w:style>
+  <w:style w:type="paragraph" w:styleId="Ttulouser">
+    <w:name w:val="Título (user)"/>
+    <w:basedOn w:val="Normal"/>
+    <w:next w:val="BodyText"/>
+    <w:pPr>
+      <w:keepNext w:val="true"/>
+      <w:spacing w:before="240" w:after="120"/>
+    </w:pPr>
+    <w:rPr>
+      <w:rFonts w:ascii="Liberation Sans" w:hAnsi="Liberation Sans" w:eastAsia="Microsoft YaHei" w:cs="Arial"/>
+      <w:sz w:val="28"/>
+      <w:szCs w:val="28"/>
+    </w:rPr>
+  </w:style>
+  <w:style w:type="paragraph" w:styleId="ndiceuser">
+    <w:name w:val="Índice (user)"/>
+    <w:basedOn w:val="Normal"/>
+    <w:pPr>
+      <w:suppressLineNumbers/>
+    </w:pPr>
+    <w:rPr>
+      <w:rFonts w:cs="Arial"/>
+    </w:rPr>
+  </w:style>
   <w:style w:type="paragraph" w:styleId="ListParagraph">
     <w:name w:val="List Paragraph"/>
     <w:basedOn w:val="Normal"/>
@@ -1106,8 +1252,8 @@
       <w:szCs w:val="56"/>
     </w:rPr>
   </w:style>
-  <w:style w:type="numbering" w:styleId="Ningunalista" w:default="1">
-    <w:name w:val="Ninguna lista"/>
+  <w:style w:type="numbering" w:styleId="Ningunalistauser" w:default="1">
+    <w:name w:val="Ninguna lista (user)"/>
     <w:uiPriority w:val="99"/>
     <w:semiHidden/>
     <w:unhideWhenUsed/>

</xml_diff>